<commit_message>
Clarify DBTable method explanation
</commit_message>
<xml_diff>
--- a/deliverables/DBTable_Final_Project_Report.docx
+++ b/deliverables/DBTable_Final_Project_Report.docx
@@ -39,8 +39,11 @@
       </w:r>
     </w:p>
     <w:p>
+      <w:pPr>
+        <w:spacing w:after="120"/>
+      </w:pPr>
       <w:r>
-        <w:t>本報告研究 DBTable 封包分類演算法。封包分類需要在大量規則中，依照來源 IP、目的 IP、來源埠、目的埠與協定五元組找到最高優先權規則。DBTable 的核心精神是利用具辨識力的 bit 將規則集合切分成較小候選集合，使查詢階段避免掃描完整 ruleset。本專案下載 AMPS 參考實作與 ClassBench 工具，並以 Python 撰寫一個可重現的 DBTable-inspired 實驗程式，實測 build time、lookup time 與 memory consumption。</w:t>
+        <w:t>本報告研究 DBTable 封包分類演算法。封包分類的目標，是在大量規則中依照來源 IP、目的 IP、來源埠、目的埠與協定，找出最高優先權的相符規則。DBTable 的重點不是把每條規則都拿來逐一檢查，而是先從規則集合中找出最有辨識力的幾個 bit，利用這些 bit 把規則分到多個小表格中。查詢封包時，只要先查到對應的小表格，再做完整五元組驗證，就能減少平均查找成本。</w:t>
       </w:r>
     </w:p>
     <w:p>
@@ -52,7 +55,7 @@
           <w:rFonts w:ascii="Microsoft JhengHei" w:hAnsi="Microsoft JhengHei"/>
           <w:color w:val="1F4E79"/>
         </w:rPr>
-        <w:t>1. 演算法介紹與架構分析</w:t>
+        <w:t>1. 論文方法的白話說明</w:t>
       </w:r>
     </w:p>
     <w:p>
@@ -64,12 +67,23 @@
           <w:rFonts w:ascii="Microsoft JhengHei" w:hAnsi="Microsoft JhengHei"/>
           <w:color w:val="1F4E79"/>
         </w:rPr>
-        <w:t>1.1 問題定義</w:t>
+        <w:t>1.1 一分鐘白話版</w:t>
       </w:r>
     </w:p>
     <w:p>
+      <w:pPr>
+        <w:spacing w:after="120"/>
+      </w:pPr>
       <w:r>
-        <w:t>封包分類輸入為 packet 五元組：source IP、destination IP、source port、destination port、protocol。規則通常包含 IP prefix、port range、protocol mask 與 priority。查詢結果必須回傳所有相符規則中優先權最高者。</w:t>
+        <w:t>可以把 DBTable 想成一個大型圖書館的快速索引。沒有索引時，找一本書要從第一排一路掃到最後一排；DBTable 的做法是先觀察所有書的特徵，挑出最能分辨書本位置的幾個欄位，做成索引卡。封包來時，先用這張索引卡找到可能的位置，再到那一小格裡逐一確認。</w:t>
+      </w:r>
+    </w:p>
+    <w:p>
+      <w:pPr>
+        <w:spacing w:after="120"/>
+      </w:pPr>
+      <w:r>
+        <w:t>套回封包分類：書本就是 rules，索引卡就是 discriminative bitsets，小格子就是 bucket。DBTable 希望每個 bucket 裡的候選規則越少越好，但又不能漏掉真正會匹配的規則。因此它會讓有 wildcard 的規則複製到多個可能 bucket，查詢時再做精確比對，保證結果仍是最高優先權的正確規則。</w:t>
       </w:r>
     </w:p>
     <w:p>
@@ -81,12 +95,329 @@
           <w:rFonts w:ascii="Microsoft JhengHei" w:hAnsi="Microsoft JhengHei"/>
           <w:color w:val="1F4E79"/>
         </w:rPr>
-        <w:t>1.2 DBTable 核心想法</w:t>
+        <w:t>1.2 DBTable 實際做的四件事</w:t>
+      </w:r>
+    </w:p>
+    <w:tbl>
+      <w:tblPr>
+        <w:tblStyle w:val="TableGrid"/>
+        <w:tblW w:type="auto" w:w="0"/>
+        <w:jc w:val="center"/>
+        <w:tblLook w:firstColumn="1" w:firstRow="1" w:lastColumn="0" w:lastRow="0" w:noHBand="0" w:noVBand="1" w:val="04A0"/>
+      </w:tblPr>
+      <w:tblGrid>
+        <w:gridCol w:w="3264"/>
+        <w:gridCol w:w="3264"/>
+        <w:gridCol w:w="3264"/>
+      </w:tblGrid>
+      <w:tr>
+        <w:tc>
+          <w:tcPr>
+            <w:tcW w:type="dxa" w:w="3264"/>
+            <w:vAlign w:val="center"/>
+          </w:tcPr>
+          <w:p>
+            <w:pPr>
+              <w:spacing w:after="40"/>
+            </w:pPr>
+            <w:r/>
+            <w:r>
+              <w:rPr>
+                <w:b/>
+              </w:rPr>
+              <w:t>步驟</w:t>
+            </w:r>
+          </w:p>
+        </w:tc>
+        <w:tc>
+          <w:tcPr>
+            <w:tcW w:type="dxa" w:w="3264"/>
+            <w:vAlign w:val="center"/>
+          </w:tcPr>
+          <w:p>
+            <w:pPr>
+              <w:spacing w:after="40"/>
+            </w:pPr>
+            <w:r/>
+            <w:r>
+              <w:rPr>
+                <w:b/>
+              </w:rPr>
+              <w:t>白話意思</w:t>
+            </w:r>
+          </w:p>
+        </w:tc>
+        <w:tc>
+          <w:tcPr>
+            <w:tcW w:type="dxa" w:w="3264"/>
+            <w:vAlign w:val="center"/>
+          </w:tcPr>
+          <w:p>
+            <w:pPr>
+              <w:spacing w:after="40"/>
+            </w:pPr>
+            <w:r/>
+            <w:r>
+              <w:rPr>
+                <w:b/>
+              </w:rPr>
+              <w:t>技術意義</w:t>
+            </w:r>
+          </w:p>
+        </w:tc>
+      </w:tr>
+      <w:tr>
+        <w:tc>
+          <w:tcPr>
+            <w:tcW w:type="dxa" w:w="3264"/>
+            <w:vAlign w:val="center"/>
+          </w:tcPr>
+          <w:p>
+            <w:pPr>
+              <w:spacing w:after="40"/>
+            </w:pPr>
+            <w:r/>
+            <w:r>
+              <w:rPr>
+                <w:b w:val="0"/>
+              </w:rPr>
+              <w:t>1. 觀察 ruleset</w:t>
+            </w:r>
+          </w:p>
+        </w:tc>
+        <w:tc>
+          <w:tcPr>
+            <w:tcW w:type="dxa" w:w="3264"/>
+            <w:vAlign w:val="center"/>
+          </w:tcPr>
+          <w:p>
+            <w:pPr>
+              <w:spacing w:after="40"/>
+            </w:pPr>
+            <w:r/>
+            <w:r>
+              <w:rPr>
+                <w:b w:val="0"/>
+              </w:rPr>
+              <w:t>先看所有規則的 IP prefix 分布，不急著查詢。</w:t>
+            </w:r>
+          </w:p>
+        </w:tc>
+        <w:tc>
+          <w:tcPr>
+            <w:tcW w:type="dxa" w:w="3264"/>
+            <w:vAlign w:val="center"/>
+          </w:tcPr>
+          <w:p>
+            <w:pPr>
+              <w:spacing w:after="40"/>
+            </w:pPr>
+            <w:r/>
+            <w:r>
+              <w:rPr>
+                <w:b w:val="0"/>
+              </w:rPr>
+              <w:t>統計來源/目的 IP bit 在規則中的分布與可分辨程度。</w:t>
+            </w:r>
+          </w:p>
+        </w:tc>
+      </w:tr>
+      <w:tr>
+        <w:tc>
+          <w:tcPr>
+            <w:tcW w:type="dxa" w:w="3264"/>
+            <w:vAlign w:val="center"/>
+          </w:tcPr>
+          <w:p>
+            <w:pPr>
+              <w:spacing w:after="40"/>
+            </w:pPr>
+            <w:r/>
+            <w:r>
+              <w:rPr>
+                <w:b w:val="0"/>
+              </w:rPr>
+              <w:t>2. 挑出有辨識力的 bit</w:t>
+            </w:r>
+          </w:p>
+        </w:tc>
+        <w:tc>
+          <w:tcPr>
+            <w:tcW w:type="dxa" w:w="3264"/>
+            <w:vAlign w:val="center"/>
+          </w:tcPr>
+          <w:p>
+            <w:pPr>
+              <w:spacing w:after="40"/>
+            </w:pPr>
+            <w:r/>
+            <w:r>
+              <w:rPr>
+                <w:b w:val="0"/>
+              </w:rPr>
+              <w:t>挑幾個最能把規則分開的問題，例如第 1 個 bit 是 0 還是 1。</w:t>
+            </w:r>
+          </w:p>
+        </w:tc>
+        <w:tc>
+          <w:tcPr>
+            <w:tcW w:type="dxa" w:w="3264"/>
+            <w:vAlign w:val="center"/>
+          </w:tcPr>
+          <w:p>
+            <w:pPr>
+              <w:spacing w:after="40"/>
+            </w:pPr>
+            <w:r/>
+            <w:r>
+              <w:rPr>
+                <w:b w:val="0"/>
+              </w:rPr>
+              <w:t>形成 discriminative bitset，讓 bucket 盡量平均、候選集合盡量小。</w:t>
+            </w:r>
+          </w:p>
+        </w:tc>
+      </w:tr>
+      <w:tr>
+        <w:tc>
+          <w:tcPr>
+            <w:tcW w:type="dxa" w:w="3264"/>
+            <w:vAlign w:val="center"/>
+          </w:tcPr>
+          <w:p>
+            <w:pPr>
+              <w:spacing w:after="40"/>
+            </w:pPr>
+            <w:r/>
+            <w:r>
+              <w:rPr>
+                <w:b w:val="0"/>
+              </w:rPr>
+              <w:t>3. 建立 bucket table</w:t>
+            </w:r>
+          </w:p>
+        </w:tc>
+        <w:tc>
+          <w:tcPr>
+            <w:tcW w:type="dxa" w:w="3264"/>
+            <w:vAlign w:val="center"/>
+          </w:tcPr>
+          <w:p>
+            <w:pPr>
+              <w:spacing w:after="40"/>
+            </w:pPr>
+            <w:r/>
+            <w:r>
+              <w:rPr>
+                <w:b w:val="0"/>
+              </w:rPr>
+              <w:t>每條規則依照這些 bit 被放到對應格子；如果規則太寬，就放到多個格子。</w:t>
+            </w:r>
+          </w:p>
+        </w:tc>
+        <w:tc>
+          <w:tcPr>
+            <w:tcW w:type="dxa" w:w="3264"/>
+            <w:vAlign w:val="center"/>
+          </w:tcPr>
+          <w:p>
+            <w:pPr>
+              <w:spacing w:after="40"/>
+            </w:pPr>
+            <w:r/>
+            <w:r>
+              <w:rPr>
+                <w:b w:val="0"/>
+              </w:rPr>
+              <w:t>處理 prefix wildcard 與 replication，建立查詢用索引表。</w:t>
+            </w:r>
+          </w:p>
+        </w:tc>
+      </w:tr>
+      <w:tr>
+        <w:tc>
+          <w:tcPr>
+            <w:tcW w:type="dxa" w:w="3264"/>
+            <w:vAlign w:val="center"/>
+          </w:tcPr>
+          <w:p>
+            <w:pPr>
+              <w:spacing w:after="40"/>
+            </w:pPr>
+            <w:r/>
+            <w:r>
+              <w:rPr>
+                <w:b w:val="0"/>
+              </w:rPr>
+              <w:t>4. 查詢時先定位再驗證</w:t>
+            </w:r>
+          </w:p>
+        </w:tc>
+        <w:tc>
+          <w:tcPr>
+            <w:tcW w:type="dxa" w:w="3264"/>
+            <w:vAlign w:val="center"/>
+          </w:tcPr>
+          <w:p>
+            <w:pPr>
+              <w:spacing w:after="40"/>
+            </w:pPr>
+            <w:r/>
+            <w:r>
+              <w:rPr>
+                <w:b w:val="0"/>
+              </w:rPr>
+              <w:t>封包先用相同 bit 找格子，再只檢查格子裡的規則。</w:t>
+            </w:r>
+          </w:p>
+        </w:tc>
+        <w:tc>
+          <w:tcPr>
+            <w:tcW w:type="dxa" w:w="3264"/>
+            <w:vAlign w:val="center"/>
+          </w:tcPr>
+          <w:p>
+            <w:pPr>
+              <w:spacing w:after="40"/>
+            </w:pPr>
+            <w:r/>
+            <w:r>
+              <w:rPr>
+                <w:b w:val="0"/>
+              </w:rPr>
+              <w:t>candidate reduction 後仍做 exact five-tuple match 與 priority selection。</w:t>
+            </w:r>
+          </w:p>
+        </w:tc>
+      </w:tr>
+    </w:tbl>
+    <w:p/>
+    <w:p>
+      <w:pPr>
+        <w:pStyle w:val="Heading2"/>
+      </w:pPr>
+      <w:r>
+        <w:rPr>
+          <w:rFonts w:ascii="Microsoft JhengHei" w:hAnsi="Microsoft JhengHei"/>
+          <w:color w:val="1F4E79"/>
+        </w:rPr>
+        <w:t>1.3 為什麼這樣會快</w:t>
       </w:r>
     </w:p>
     <w:p>
+      <w:pPr>
+        <w:spacing w:after="120"/>
+      </w:pPr>
       <w:r>
-        <w:t>DBTable 以 discriminative bits 建立 bucket table。建表時先分析 ruleset 中哪些 IP bit 能把規則切得最平均，再以這些 bit 形成 bucket key。查詢時，packet 只需取出相同 bit 形成 key，進入對應 bucket 後再做完整五元組驗證。這種設計把 lookup 成本從完整 ruleset scan 降低為小型候選集合 scan。AMPS 的 C++ 版本還包含更細緻的 subset、ip_node、prefix_tuple 與 port_node 結構。</w:t>
+        <w:t>封包分類慢，通常不是因為判斷一條規則很難，而是因為規則太多。若 ruleset 有十萬筆，每個封包都掃十萬筆會很慢。DBTable 的加速點在於：先用少數 bit 做快速索引，把候選規則從十萬筆縮到一個 bucket 裡的幾百筆，最後才做完整五元組比對。</w:t>
+      </w:r>
+    </w:p>
+    <w:p>
+      <w:pPr>
+        <w:spacing w:after="120"/>
+      </w:pPr>
+      <w:r>
+        <w:t>這也解釋了 DBTable 的取捨：它用較多建表時間與額外記憶體，換取查詢時少掃很多規則。若規則的 IP prefix 分布很有規律，選到的 discriminative bits 可以把規則切得很開，DBTable 就會有好效果；若規則充滿 wildcard，規則會被複製到很多 bucket，記憶體與建表成本就會上升。</w:t>
       </w:r>
     </w:p>
     <w:p>
@@ -98,7 +429,401 @@
           <w:rFonts w:ascii="Microsoft JhengHei" w:hAnsi="Microsoft JhengHei"/>
           <w:color w:val="1F4E79"/>
         </w:rPr>
-        <w:t>1.3 架構圖</w:t>
+        <w:t>1.4 與論文名詞對照</w:t>
+      </w:r>
+    </w:p>
+    <w:tbl>
+      <w:tblPr>
+        <w:tblStyle w:val="TableGrid"/>
+        <w:tblW w:type="auto" w:w="0"/>
+        <w:jc w:val="center"/>
+        <w:tblLook w:firstColumn="1" w:firstRow="1" w:lastColumn="0" w:lastRow="0" w:noHBand="0" w:noVBand="1" w:val="04A0"/>
+      </w:tblPr>
+      <w:tblGrid>
+        <w:gridCol w:w="3264"/>
+        <w:gridCol w:w="3264"/>
+        <w:gridCol w:w="3264"/>
+      </w:tblGrid>
+      <w:tr>
+        <w:tc>
+          <w:tcPr>
+            <w:tcW w:type="dxa" w:w="3264"/>
+            <w:vAlign w:val="center"/>
+          </w:tcPr>
+          <w:p>
+            <w:pPr>
+              <w:spacing w:after="40"/>
+            </w:pPr>
+            <w:r/>
+            <w:r>
+              <w:rPr>
+                <w:b/>
+              </w:rPr>
+              <w:t>論文/程式名詞</w:t>
+            </w:r>
+          </w:p>
+        </w:tc>
+        <w:tc>
+          <w:tcPr>
+            <w:tcW w:type="dxa" w:w="3264"/>
+            <w:vAlign w:val="center"/>
+          </w:tcPr>
+          <w:p>
+            <w:pPr>
+              <w:spacing w:after="40"/>
+            </w:pPr>
+            <w:r/>
+            <w:r>
+              <w:rPr>
+                <w:b/>
+              </w:rPr>
+              <w:t>白話解釋</w:t>
+            </w:r>
+          </w:p>
+        </w:tc>
+        <w:tc>
+          <w:tcPr>
+            <w:tcW w:type="dxa" w:w="3264"/>
+            <w:vAlign w:val="center"/>
+          </w:tcPr>
+          <w:p>
+            <w:pPr>
+              <w:spacing w:after="40"/>
+            </w:pPr>
+            <w:r/>
+            <w:r>
+              <w:rPr>
+                <w:b/>
+              </w:rPr>
+              <w:t>在本專案中的對應</w:t>
+            </w:r>
+          </w:p>
+        </w:tc>
+      </w:tr>
+      <w:tr>
+        <w:tc>
+          <w:tcPr>
+            <w:tcW w:type="dxa" w:w="3264"/>
+            <w:vAlign w:val="center"/>
+          </w:tcPr>
+          <w:p>
+            <w:pPr>
+              <w:spacing w:after="40"/>
+            </w:pPr>
+            <w:r/>
+            <w:r>
+              <w:rPr>
+                <w:b w:val="0"/>
+              </w:rPr>
+              <w:t>Discriminative bitsets</w:t>
+            </w:r>
+          </w:p>
+        </w:tc>
+        <w:tc>
+          <w:tcPr>
+            <w:tcW w:type="dxa" w:w="3264"/>
+            <w:vAlign w:val="center"/>
+          </w:tcPr>
+          <w:p>
+            <w:pPr>
+              <w:spacing w:after="40"/>
+            </w:pPr>
+            <w:r/>
+            <w:r>
+              <w:rPr>
+                <w:b w:val="0"/>
+              </w:rPr>
+              <w:t>最能把規則分群的 bit 集合。</w:t>
+            </w:r>
+          </w:p>
+        </w:tc>
+        <w:tc>
+          <w:tcPr>
+            <w:tcW w:type="dxa" w:w="3264"/>
+            <w:vAlign w:val="center"/>
+          </w:tcPr>
+          <w:p>
+            <w:pPr>
+              <w:spacing w:after="40"/>
+            </w:pPr>
+            <w:r/>
+            <w:r>
+              <w:rPr>
+                <w:b w:val="0"/>
+              </w:rPr>
+              <w:t>src/dbtable_classifier.py 會對 64 個來源/目的 IP bit 排名並選出 12 個。</w:t>
+            </w:r>
+          </w:p>
+        </w:tc>
+      </w:tr>
+      <w:tr>
+        <w:tc>
+          <w:tcPr>
+            <w:tcW w:type="dxa" w:w="3264"/>
+            <w:vAlign w:val="center"/>
+          </w:tcPr>
+          <w:p>
+            <w:pPr>
+              <w:spacing w:after="40"/>
+            </w:pPr>
+            <w:r/>
+            <w:r>
+              <w:rPr>
+                <w:b w:val="0"/>
+              </w:rPr>
+              <w:t>Bucket table</w:t>
+            </w:r>
+          </w:p>
+        </w:tc>
+        <w:tc>
+          <w:tcPr>
+            <w:tcW w:type="dxa" w:w="3264"/>
+            <w:vAlign w:val="center"/>
+          </w:tcPr>
+          <w:p>
+            <w:pPr>
+              <w:spacing w:after="40"/>
+            </w:pPr>
+            <w:r/>
+            <w:r>
+              <w:rPr>
+                <w:b w:val="0"/>
+              </w:rPr>
+              <w:t>查詢用索引表，每個 key 對到一小群候選規則。</w:t>
+            </w:r>
+          </w:p>
+        </w:tc>
+        <w:tc>
+          <w:tcPr>
+            <w:tcW w:type="dxa" w:w="3264"/>
+            <w:vAlign w:val="center"/>
+          </w:tcPr>
+          <w:p>
+            <w:pPr>
+              <w:spacing w:after="40"/>
+            </w:pPr>
+            <w:r/>
+            <w:r>
+              <w:rPr>
+                <w:b w:val="0"/>
+              </w:rPr>
+              <w:t>buckets: dict[int, list[int]]。</w:t>
+            </w:r>
+          </w:p>
+        </w:tc>
+      </w:tr>
+      <w:tr>
+        <w:tc>
+          <w:tcPr>
+            <w:tcW w:type="dxa" w:w="3264"/>
+            <w:vAlign w:val="center"/>
+          </w:tcPr>
+          <w:p>
+            <w:pPr>
+              <w:spacing w:after="40"/>
+            </w:pPr>
+            <w:r/>
+            <w:r>
+              <w:rPr>
+                <w:b w:val="0"/>
+              </w:rPr>
+              <w:t>Wildcard / prefix replication</w:t>
+            </w:r>
+          </w:p>
+        </w:tc>
+        <w:tc>
+          <w:tcPr>
+            <w:tcW w:type="dxa" w:w="3264"/>
+            <w:vAlign w:val="center"/>
+          </w:tcPr>
+          <w:p>
+            <w:pPr>
+              <w:spacing w:after="40"/>
+            </w:pPr>
+            <w:r/>
+            <w:r>
+              <w:rPr>
+                <w:b w:val="0"/>
+              </w:rPr>
+              <w:t>規則沒有指定某個 bit 時，它可能屬於多個 bucket。</w:t>
+            </w:r>
+          </w:p>
+        </w:tc>
+        <w:tc>
+          <w:tcPr>
+            <w:tcW w:type="dxa" w:w="3264"/>
+            <w:vAlign w:val="center"/>
+          </w:tcPr>
+          <w:p>
+            <w:pPr>
+              <w:spacing w:after="40"/>
+            </w:pPr>
+            <w:r/>
+            <w:r>
+              <w:rPr>
+                <w:b w:val="0"/>
+              </w:rPr>
+              <w:t>_rule_signatures() 會產生多個相容 key。</w:t>
+            </w:r>
+          </w:p>
+        </w:tc>
+      </w:tr>
+      <w:tr>
+        <w:tc>
+          <w:tcPr>
+            <w:tcW w:type="dxa" w:w="3264"/>
+            <w:vAlign w:val="center"/>
+          </w:tcPr>
+          <w:p>
+            <w:pPr>
+              <w:spacing w:after="40"/>
+            </w:pPr>
+            <w:r/>
+            <w:r>
+              <w:rPr>
+                <w:b w:val="0"/>
+              </w:rPr>
+              <w:t>Exact match</w:t>
+            </w:r>
+          </w:p>
+        </w:tc>
+        <w:tc>
+          <w:tcPr>
+            <w:tcW w:type="dxa" w:w="3264"/>
+            <w:vAlign w:val="center"/>
+          </w:tcPr>
+          <w:p>
+            <w:pPr>
+              <w:spacing w:after="40"/>
+            </w:pPr>
+            <w:r/>
+            <w:r>
+              <w:rPr>
+                <w:b w:val="0"/>
+              </w:rPr>
+              <w:t>最後仍要完整檢查五元組，不能只靠索引猜答案。</w:t>
+            </w:r>
+          </w:p>
+        </w:tc>
+        <w:tc>
+          <w:tcPr>
+            <w:tcW w:type="dxa" w:w="3264"/>
+            <w:vAlign w:val="center"/>
+          </w:tcPr>
+          <w:p>
+            <w:pPr>
+              <w:spacing w:after="40"/>
+            </w:pPr>
+            <w:r/>
+            <w:r>
+              <w:rPr>
+                <w:b w:val="0"/>
+              </w:rPr>
+              <w:t>rule_matches() 檢查 IP prefix、port range、protocol mask。</w:t>
+            </w:r>
+          </w:p>
+        </w:tc>
+      </w:tr>
+      <w:tr>
+        <w:tc>
+          <w:tcPr>
+            <w:tcW w:type="dxa" w:w="3264"/>
+            <w:vAlign w:val="center"/>
+          </w:tcPr>
+          <w:p>
+            <w:pPr>
+              <w:spacing w:after="40"/>
+            </w:pPr>
+            <w:r/>
+            <w:r>
+              <w:rPr>
+                <w:b w:val="0"/>
+              </w:rPr>
+              <w:t>Highest priority rule</w:t>
+            </w:r>
+          </w:p>
+        </w:tc>
+        <w:tc>
+          <w:tcPr>
+            <w:tcW w:type="dxa" w:w="3264"/>
+            <w:vAlign w:val="center"/>
+          </w:tcPr>
+          <w:p>
+            <w:pPr>
+              <w:spacing w:after="40"/>
+            </w:pPr>
+            <w:r/>
+            <w:r>
+              <w:rPr>
+                <w:b w:val="0"/>
+              </w:rPr>
+              <w:t>多條規則匹配時，回傳優先權最高者。</w:t>
+            </w:r>
+          </w:p>
+        </w:tc>
+        <w:tc>
+          <w:tcPr>
+            <w:tcW w:type="dxa" w:w="3264"/>
+            <w:vAlign w:val="center"/>
+          </w:tcPr>
+          <w:p>
+            <w:pPr>
+              <w:spacing w:after="40"/>
+            </w:pPr>
+            <w:r/>
+            <w:r>
+              <w:rPr>
+                <w:b w:val="0"/>
+              </w:rPr>
+              <w:t>bucket 內依 priority 排序，找到最早匹配規則。</w:t>
+            </w:r>
+          </w:p>
+        </w:tc>
+      </w:tr>
+    </w:tbl>
+    <w:p/>
+    <w:p>
+      <w:pPr>
+        <w:pStyle w:val="Heading1"/>
+      </w:pPr>
+      <w:r>
+        <w:rPr>
+          <w:rFonts w:ascii="Microsoft JhengHei" w:hAnsi="Microsoft JhengHei"/>
+          <w:color w:val="1F4E79"/>
+        </w:rPr>
+        <w:t>2. 演算法介紹與架構分析</w:t>
+      </w:r>
+    </w:p>
+    <w:p>
+      <w:pPr>
+        <w:pStyle w:val="Heading2"/>
+      </w:pPr>
+      <w:r>
+        <w:rPr>
+          <w:rFonts w:ascii="Microsoft JhengHei" w:hAnsi="Microsoft JhengHei"/>
+          <w:color w:val="1F4E79"/>
+        </w:rPr>
+        <w:t>2.1 問題定義</w:t>
+      </w:r>
+    </w:p>
+    <w:p>
+      <w:pPr>
+        <w:spacing w:after="120"/>
+      </w:pPr>
+      <w:r>
+        <w:t>封包分類輸入為 packet 五元組：source IP、destination IP、source port、destination port、protocol。規則包含 IP prefix、port range、protocol mask 與 priority。查詢結果必須回傳所有相符規則中優先權最高者。</w:t>
+      </w:r>
+    </w:p>
+    <w:p>
+      <w:pPr>
+        <w:pStyle w:val="Heading2"/>
+      </w:pPr>
+      <w:r>
+        <w:rPr>
+          <w:rFonts w:ascii="Microsoft JhengHei" w:hAnsi="Microsoft JhengHei"/>
+          <w:color w:val="1F4E79"/>
+        </w:rPr>
+        <w:t>2.2 架構流程</w:t>
       </w:r>
     </w:p>
     <w:p>
@@ -253,7 +978,7 @@
               <w:rPr>
                 <w:b w:val="0"/>
               </w:rPr>
-              <w:t>解析 IP prefix、port range、protocol mask、priority</w:t>
+              <w:t>解析 IP prefix、port range、protocol mask、priority。</w:t>
             </w:r>
           </w:p>
         </w:tc>
@@ -327,7 +1052,7 @@
               <w:rPr>
                 <w:b w:val="0"/>
               </w:rPr>
-              <w:t>計算每個 IP bit 的分割平衡度與覆蓋率</w:t>
+              <w:t>計算每個 IP bit 的分割平衡度與覆蓋率。</w:t>
             </w:r>
           </w:p>
         </w:tc>
@@ -345,7 +1070,7 @@
               <w:rPr>
                 <w:b w:val="0"/>
               </w:rPr>
-              <w:t>Selected discriminative bits</w:t>
+              <w:t>Selected bits</w:t>
             </w:r>
           </w:p>
         </w:tc>
@@ -401,7 +1126,7 @@
               <w:rPr>
                 <w:b w:val="0"/>
               </w:rPr>
-              <w:t>依 selected bits 建立 bucket；wildcard bit 會複製到多個 bucket</w:t>
+              <w:t>依 selected bits 建立 bucket；wildcard bit 會複製到多個 bucket。</w:t>
             </w:r>
           </w:p>
         </w:tc>
@@ -475,7 +1200,7 @@
               <w:rPr>
                 <w:b w:val="0"/>
               </w:rPr>
-              <w:t>取 packet key，掃描候選 bucket，做精確五元組比對</w:t>
+              <w:t>取 packet key，掃描候選 bucket，做精確五元組比對。</w:t>
             </w:r>
           </w:p>
         </w:tc>
@@ -509,12 +1234,15 @@
           <w:rFonts w:ascii="Microsoft JhengHei" w:hAnsi="Microsoft JhengHei"/>
           <w:color w:val="1F4E79"/>
         </w:rPr>
-        <w:t>2. 實作方法</w:t>
+        <w:t>3. 實作方法</w:t>
       </w:r>
     </w:p>
     <w:p>
+      <w:pPr>
+        <w:spacing w:after="120"/>
+      </w:pPr>
       <w:r>
-        <w:t>本專案實作位於 src/ 與 scripts/。為了讓實驗能在一般課程環境重現，使用 Python 撰寫 DBTable-inspired classifier；外部 AMPS C++ 原始碼保留在 external/amps 作為演算法參考。</w:t>
+        <w:t>本專案實作位於 src/ 與 scripts/。為了讓實驗可重現，使用 Python 撰寫 DBTable-inspired classifier；外部 AMPS C++ 原始碼保留在 external/amps 作為參考。此實作保留 DBTable 用 discriminative bits 減少候選規則的核心概念，但不是 AMPS C++ DBTable 的逐行移植。</w:t>
       </w:r>
     </w:p>
     <w:tbl>
@@ -599,7 +1327,7 @@
               <w:rPr>
                 <w:b w:val="0"/>
               </w:rPr>
-              <w:t>ClassBench rule/trace parser 與精確五元組 match helper</w:t>
+              <w:t>ClassBench rule/trace parser 與精確五元組 match helper。</w:t>
             </w:r>
           </w:p>
         </w:tc>
@@ -637,7 +1365,7 @@
               <w:rPr>
                 <w:b w:val="0"/>
               </w:rPr>
-              <w:t>DBTable-inspired discriminative-bit bucket classifier</w:t>
+              <w:t>DBTable-inspired discriminative-bit bucket classifier。</w:t>
             </w:r>
           </w:p>
         </w:tc>
@@ -675,7 +1403,7 @@
               <w:rPr>
                 <w:b w:val="0"/>
               </w:rPr>
-              <w:t>產生 build time、lookup time、memory consumption 結果</w:t>
+              <w:t>產生 build time、lookup time、memory consumption 結果。</w:t>
             </w:r>
           </w:p>
         </w:tc>
@@ -713,7 +1441,7 @@
               <w:rPr>
                 <w:b w:val="0"/>
               </w:rPr>
-              <w:t>以線性掃描抽樣驗證查詢正確性</w:t>
+              <w:t>以線性掃描抽樣驗證查詢正確性。</w:t>
             </w:r>
           </w:p>
         </w:tc>
@@ -751,18 +1479,13 @@
               <w:rPr>
                 <w:b w:val="0"/>
               </w:rPr>
-              <w:t>從 ClassBench seed 重新產生資料集的輔助腳本</w:t>
+              <w:t>從 ClassBench seed 重新產生資料集的輔助腳本。</w:t>
             </w:r>
           </w:p>
         </w:tc>
       </w:tr>
     </w:tbl>
     <w:p/>
-    <w:p>
-      <w:r>
-        <w:t>限制說明：此實作保留 DBTable 用 discriminative bits 減少候選規則的核心概念，但不是 AMPS C++ DBTable 的逐行移植；AMPS 版本包含更完整的 subset/tuple/port-node 調整策略。本實作適合作為課程實驗與報告分析基礎。</w:t>
-      </w:r>
-    </w:p>
     <w:p>
       <w:pPr>
         <w:pStyle w:val="Heading1"/>
@@ -772,7 +1495,7 @@
           <w:rFonts w:ascii="Microsoft JhengHei" w:hAnsi="Microsoft JhengHei"/>
           <w:color w:val="1F4E79"/>
         </w:rPr>
-        <w:t>3. 實驗與效能評估</w:t>
+        <w:t>4. 實驗與效能評估</w:t>
       </w:r>
     </w:p>
     <w:p>
@@ -784,15 +1507,21 @@
           <w:rFonts w:ascii="Microsoft JhengHei" w:hAnsi="Microsoft JhengHei"/>
           <w:color w:val="1F4E79"/>
         </w:rPr>
-        <w:t>3.1 資料集與執行方式</w:t>
+        <w:t>4.1 資料集與執行方式</w:t>
       </w:r>
     </w:p>
     <w:p>
+      <w:pPr>
+        <w:spacing w:after="120"/>
+      </w:pPr>
       <w:r>
         <w:t>使用 ClassBench ACL1 100K rules 檔案 data/classbench/acl1_100000.txt 與對應 trace。此下載檔名為 100K，實際有效可解析規則數為 99,330 筆，trace 測試封包數為 100,000 筆。</w:t>
       </w:r>
     </w:p>
     <w:p>
+      <w:pPr>
+        <w:spacing w:after="120"/>
+      </w:pPr>
       <w:r>
         <w:t>執行指令：python scripts/run_experiment.py --max-traces 100000</w:t>
       </w:r>
@@ -806,7 +1535,7 @@
           <w:rFonts w:ascii="Microsoft JhengHei" w:hAnsi="Microsoft JhengHei"/>
           <w:color w:val="1F4E79"/>
         </w:rPr>
-        <w:t>3.2 實驗結果</w:t>
+        <w:t>4.2 實驗結果</w:t>
       </w:r>
     </w:p>
     <w:tbl>
@@ -1279,8 +2008,11 @@
     </w:tbl>
     <w:p/>
     <w:p>
+      <w:pPr>
+        <w:spacing w:after="120"/>
+      </w:pPr>
       <w:r>
-        <w:t>結果顯示，selected bits 將近十萬筆規則分散到 4096 個 bucket，平均每個 bucket 約 169 筆規則。因此 lookup 階段主要成本集中在候選 bucket 的少量規則驗證，而不是完整 ruleset 掃描。</w:t>
+        <w:t>結果顯示，selected bits 將近十萬筆規則分散到 4096 個 bucket，平均每個 bucket 約 169 筆規則。這代表查詢階段大多只需要檢查候選 bucket，而不是掃描完整 ruleset。</w:t>
       </w:r>
     </w:p>
     <w:p>
@@ -1292,12 +2024,15 @@
           <w:rFonts w:ascii="Microsoft JhengHei" w:hAnsi="Microsoft JhengHei"/>
           <w:color w:val="1F4E79"/>
         </w:rPr>
-        <w:t>4. 與組員演算法比較分析</w:t>
+        <w:t>5. 與組員的比較分析</w:t>
       </w:r>
     </w:p>
     <w:p>
+      <w:pPr>
+        <w:spacing w:after="120"/>
+      </w:pPr>
       <w:r>
-        <w:t>注意：以下比較表已預留同組另外兩位組員的演算法與數據欄位。請在取得組員實測結果後替換 Algorithm A/B 與數值。若同組成員尚未提供結果，可先以此章節的分析框架完成初稿。</w:t>
+        <w:t>以下比較表已預留同組另外兩位組員的演算法與數據欄位。取得組員實測結果後，請替換 Algorithm A/B 與數值。</w:t>
       </w:r>
     </w:p>
     <w:tbl>
@@ -1420,7 +2155,7 @@
               <w:rPr>
                 <w:b w:val="0"/>
               </w:rPr>
-              <w:t>用 discriminative bits 建 bucket，先縮小候選集合</w:t>
+              <w:t>用 discriminative bits 建 bucket，先縮小候選集合。</w:t>
             </w:r>
           </w:p>
         </w:tc>
@@ -1438,7 +2173,7 @@
               <w:rPr>
                 <w:b w:val="0"/>
               </w:rPr>
-              <w:t>請填：例如 tuple-space/hash/tree</w:t>
+              <w:t>請填：例如 tuple-space/hash/tree。</w:t>
             </w:r>
           </w:p>
         </w:tc>
@@ -1456,7 +2191,7 @@
               <w:rPr>
                 <w:b w:val="0"/>
               </w:rPr>
-              <w:t>請填：例如 decision tree/cut/split</w:t>
+              <w:t>請填：例如 decision tree/cut/split。</w:t>
             </w:r>
           </w:p>
         </w:tc>
@@ -1716,7 +2451,7 @@
               <w:rPr>
                 <w:b w:val="0"/>
               </w:rPr>
-              <w:t>查詢候選集合小；對高可分辨 IP bits 的 ACL ruleset 有利</w:t>
+              <w:t>候選集合小；對高可分辨 IP bits 的 ACL ruleset 有利。</w:t>
             </w:r>
           </w:p>
         </w:tc>
@@ -1790,7 +2525,7 @@
               <w:rPr>
                 <w:b w:val="0"/>
               </w:rPr>
-              <w:t>wildcard prefix 可能造成 bucket replication；完整版本實作複雜</w:t>
+              <w:t>wildcard prefix 可能造成 bucket replication；完整版本實作複雜。</w:t>
             </w:r>
           </w:p>
         </w:tc>
@@ -1864,7 +2599,7 @@
               <w:rPr>
                 <w:b w:val="0"/>
               </w:rPr>
-              <w:t>規則 IP prefix 具明顯分布差異、需要低平均 lookup latency</w:t>
+              <w:t>規則 IP prefix 具明顯分布差異、需要低平均 lookup latency。</w:t>
             </w:r>
           </w:p>
         </w:tc>
@@ -1908,8 +2643,11 @@
     </w:tbl>
     <w:p/>
     <w:p>
+      <w:pPr>
+        <w:spacing w:after="120"/>
+      </w:pPr>
       <w:r>
-        <w:t>定性比較上，若組員選的是 tuple-space search 類方法，其優點通常是結構簡單且 incremental update 較直覺，但 lookup 可能需查多個 tuple。若組員選的是 decision-tree/cut/split 類方法，其查詢路徑可能很短，但建樹成本、記憶體膨脹與 rule replication 會是主要風險。DBTable 位於兩者之間：它使用 bit-based bucket 取得快速候選定位，同時保留精確比對避免分類錯誤。</w:t>
+        <w:t>若組員選的是 tuple-space search 類方法，其優點通常是結構簡單且 incremental update 較直覺，但 lookup 可能需查多個 tuple。若組員選的是 decision-tree/cut/split 類方法，其查詢路徑可能很短，但建樹成本、記憶體膨脹與 rule replication 會是主要風險。DBTable 位於兩者之間：它使用 bit-based bucket 取得快速候選定位，同時保留精確比對避免分類錯誤。</w:t>
       </w:r>
     </w:p>
     <w:p>
@@ -1921,12 +2659,15 @@
           <w:rFonts w:ascii="Microsoft JhengHei" w:hAnsi="Microsoft JhengHei"/>
           <w:color w:val="1F4E79"/>
         </w:rPr>
-        <w:t>5. 結論</w:t>
+        <w:t>6. 結論</w:t>
       </w:r>
     </w:p>
     <w:p>
+      <w:pPr>
+        <w:spacing w:after="120"/>
+      </w:pPr>
       <w:r>
-        <w:t>DBTable 的價值在於將 ruleset 的分布特性轉換成查詢前的 bucket index，使 packet lookup 不必面對完整規則集合。本次實驗在 ClassBench ACL1 100K 資料上完成建表、查詢與記憶體估計，並透過線性掃描抽樣驗證正確性。後續若要更貼近論文與 AMPS 實作，可將 prefix_tuple、port_node、動態 tuple range 與 C++ SIMD/hash optimization 納入。</w:t>
+        <w:t>DBTable 的價值在於把 ruleset 的分布特性轉換成快速 bucket index，使 packet lookup 不必面對完整規則集合。本次實驗在 ClassBench ACL1 100K 資料上完成建表、查詢與記憶體估計，並透過線性掃描抽樣驗證正確性。後續若要更貼近論文與 AMPS 實作，可將 prefix_tuple、port_node、動態 tuple range 與 C++ SIMD/hash optimization 納入。</w:t>
       </w:r>
     </w:p>
     <w:p>

</xml_diff>

<commit_message>
Add teammate algorithm comparison
</commit_message>
<xml_diff>
--- a/deliverables/DBTable_Final_Project_Report.docx
+++ b/deliverables/DBTable_Final_Project_Report.docx
@@ -2032,7 +2032,7 @@
         <w:spacing w:after="120"/>
       </w:pPr>
       <w:r>
-        <w:t>以下比較表已預留同組另外兩位組員的演算法與數據欄位。取得組員實測結果後，請替換 Algorithm A/B 與數值。</w:t>
+        <w:t>本節比較 DBTable、HybridTSS 與 CutSplit 三種方法。需要注意的是，本專案的 DBTable 是 Python 教學版 DBTable-inspired implementation；組員的 HybridTSS 與 CutSplit 數據可能來自不同語言或最佳化程度，因此絕對數字同時反映演算法與實作差異。不過，這些數據仍可用來分析不同方法在 build time、lookup time 與 memory 的取捨。</w:t>
       </w:r>
     </w:p>
     <w:tbl>
@@ -2081,7 +2081,7 @@
               <w:rPr>
                 <w:b/>
               </w:rPr>
-              <w:t>DBTable</w:t>
+              <w:t>DBTable（本專案）</w:t>
             </w:r>
           </w:p>
         </w:tc>
@@ -2099,7 +2099,7 @@
               <w:rPr>
                 <w:b/>
               </w:rPr>
-              <w:t>Algorithm A（請填組員演算法）</w:t>
+              <w:t>HybridTSS（組員一）</w:t>
             </w:r>
           </w:p>
         </w:tc>
@@ -2117,7 +2117,7 @@
               <w:rPr>
                 <w:b/>
               </w:rPr>
-              <w:t>Algorithm B（請填組員演算法）</w:t>
+              <w:t>CutSplit（組員二）</w:t>
             </w:r>
           </w:p>
         </w:tc>
@@ -2173,7 +2173,7 @@
               <w:rPr>
                 <w:b w:val="0"/>
               </w:rPr>
-              <w:t>請填：例如 tuple-space/hash/tree。</w:t>
+              <w:t>以 tuple space/hash 類索引快速定位相同 tuple 的候選規則。</w:t>
             </w:r>
           </w:p>
         </w:tc>
@@ -2191,7 +2191,81 @@
               <w:rPr>
                 <w:b w:val="0"/>
               </w:rPr>
-              <w:t>請填：例如 decision tree/cut/split。</w:t>
+              <w:t>以 cut/split 決策結構切分搜尋空間，讓封包沿路徑找到候選規則。</w:t>
+            </w:r>
+          </w:p>
+        </w:tc>
+      </w:tr>
+      <w:tr>
+        <w:tc>
+          <w:tcPr>
+            <w:tcW w:type="dxa" w:w="2448"/>
+            <w:vAlign w:val="center"/>
+          </w:tcPr>
+          <w:p>
+            <w:pPr>
+              <w:spacing w:after="40"/>
+            </w:pPr>
+            <w:r/>
+            <w:r>
+              <w:rPr>
+                <w:b w:val="0"/>
+              </w:rPr>
+              <w:t>Rules loaded</w:t>
+            </w:r>
+          </w:p>
+        </w:tc>
+        <w:tc>
+          <w:tcPr>
+            <w:tcW w:type="dxa" w:w="2448"/>
+            <w:vAlign w:val="center"/>
+          </w:tcPr>
+          <w:p>
+            <w:pPr>
+              <w:spacing w:after="40"/>
+            </w:pPr>
+            <w:r/>
+            <w:r>
+              <w:rPr>
+                <w:b w:val="0"/>
+              </w:rPr>
+              <w:t>99,330</w:t>
+            </w:r>
+          </w:p>
+        </w:tc>
+        <w:tc>
+          <w:tcPr>
+            <w:tcW w:type="dxa" w:w="2448"/>
+            <w:vAlign w:val="center"/>
+          </w:tcPr>
+          <w:p>
+            <w:pPr>
+              <w:spacing w:after="40"/>
+            </w:pPr>
+            <w:r/>
+            <w:r>
+              <w:rPr>
+                <w:b w:val="0"/>
+              </w:rPr>
+              <w:t>未提供</w:t>
+            </w:r>
+          </w:p>
+        </w:tc>
+        <w:tc>
+          <w:tcPr>
+            <w:tcW w:type="dxa" w:w="2448"/>
+            <w:vAlign w:val="center"/>
+          </w:tcPr>
+          <w:p>
+            <w:pPr>
+              <w:spacing w:after="40"/>
+            </w:pPr>
+            <w:r/>
+            <w:r>
+              <w:rPr>
+                <w:b w:val="0"/>
+              </w:rPr>
+              <w:t>99,833</w:t>
             </w:r>
           </w:p>
         </w:tc>
@@ -2247,7 +2321,7 @@
               <w:rPr>
                 <w:b w:val="0"/>
               </w:rPr>
-              <w:t>請填</w:t>
+              <w:t>0.0249 s</w:t>
             </w:r>
           </w:p>
         </w:tc>
@@ -2265,7 +2339,7 @@
               <w:rPr>
                 <w:b w:val="0"/>
               </w:rPr>
-              <w:t>請填</w:t>
+              <w:t>0.4625 s</w:t>
             </w:r>
           </w:p>
         </w:tc>
@@ -2285,7 +2359,7 @@
               <w:rPr>
                 <w:b w:val="0"/>
               </w:rPr>
-              <w:t>Lookup avg</w:t>
+              <w:t>Average lookup time</w:t>
             </w:r>
           </w:p>
         </w:tc>
@@ -2321,7 +2395,7 @@
               <w:rPr>
                 <w:b w:val="0"/>
               </w:rPr>
-              <w:t>請填</w:t>
+              <w:t>133.987 ns</w:t>
             </w:r>
           </w:p>
         </w:tc>
@@ -2339,7 +2413,7 @@
               <w:rPr>
                 <w:b w:val="0"/>
               </w:rPr>
-              <w:t>請填</w:t>
+              <w:t>300.719 ns</w:t>
             </w:r>
           </w:p>
         </w:tc>
@@ -2395,7 +2469,7 @@
               <w:rPr>
                 <w:b w:val="0"/>
               </w:rPr>
-              <w:t>請填</w:t>
+              <w:t>709.45 MiB</w:t>
             </w:r>
           </w:p>
         </w:tc>
@@ -2413,7 +2487,7 @@
               <w:rPr>
                 <w:b w:val="0"/>
               </w:rPr>
-              <w:t>請填</w:t>
+              <w:t>0.512 MiB</w:t>
             </w:r>
           </w:p>
         </w:tc>
@@ -2451,7 +2525,7 @@
               <w:rPr>
                 <w:b w:val="0"/>
               </w:rPr>
-              <w:t>候選集合小；對高可分辨 IP bits 的 ACL ruleset 有利。</w:t>
+              <w:t>概念上能把查詢縮到小 bucket，且最後仍做 exact match。</w:t>
             </w:r>
           </w:p>
         </w:tc>
@@ -2469,7 +2543,7 @@
               <w:rPr>
                 <w:b w:val="0"/>
               </w:rPr>
-              <w:t>請填</w:t>
+              <w:t>lookup time 最低，適合極度重視查詢延遲且記憶體充足的情境。</w:t>
             </w:r>
           </w:p>
         </w:tc>
@@ -2487,7 +2561,7 @@
               <w:rPr>
                 <w:b w:val="0"/>
               </w:rPr>
-              <w:t>請填</w:t>
+              <w:t>build/lookup/memory 三者都很均衡，本次數據中 memory 最低。</w:t>
             </w:r>
           </w:p>
         </w:tc>
@@ -2525,7 +2599,7 @@
               <w:rPr>
                 <w:b w:val="0"/>
               </w:rPr>
-              <w:t>wildcard prefix 可能造成 bucket replication；完整版本實作複雜。</w:t>
+              <w:t>目前 Python 教學版 lookup 較慢；wildcard prefix 可能造成 bucket replication。</w:t>
             </w:r>
           </w:p>
         </w:tc>
@@ -2543,7 +2617,7 @@
               <w:rPr>
                 <w:b w:val="0"/>
               </w:rPr>
-              <w:t>請填</w:t>
+              <w:t>memory consumption 很高，約為 DBTable 實測的 34.5 倍。</w:t>
             </w:r>
           </w:p>
         </w:tc>
@@ -2561,7 +2635,7 @@
               <w:rPr>
                 <w:b w:val="0"/>
               </w:rPr>
-              <w:t>請填</w:t>
+              <w:t>lookup 比 HybridTSS 慢，但仍遠快於本專案 Python DBTable；決策切分品質依 ruleset 分布而定。</w:t>
             </w:r>
           </w:p>
         </w:tc>
@@ -2599,7 +2673,7 @@
               <w:rPr>
                 <w:b w:val="0"/>
               </w:rPr>
-              <w:t>規則 IP prefix 具明顯分布差異、需要低平均 lookup latency。</w:t>
+              <w:t>規則 IP prefix 具明顯分布差異，且可接受建表與記憶體換 lookup。</w:t>
             </w:r>
           </w:p>
         </w:tc>
@@ -2617,7 +2691,7 @@
               <w:rPr>
                 <w:b w:val="0"/>
               </w:rPr>
-              <w:t>請填</w:t>
+              <w:t>記憶體不是瓶頸、需要最低平均 lookup latency。</w:t>
             </w:r>
           </w:p>
         </w:tc>
@@ -2635,7 +2709,7 @@
               <w:rPr>
                 <w:b w:val="0"/>
               </w:rPr>
-              <w:t>請填</w:t>
+              <w:t>需要低記憶體且仍保有快速查詢的整體平衡情境。</w:t>
             </w:r>
           </w:p>
         </w:tc>
@@ -2647,7 +2721,7 @@
         <w:spacing w:after="120"/>
       </w:pPr>
       <w:r>
-        <w:t>若組員選的是 tuple-space search 類方法，其優點通常是結構簡單且 incremental update 較直覺，但 lookup 可能需查多個 tuple。若組員選的是 decision-tree/cut/split 類方法，其查詢路徑可能很短，但建樹成本、記憶體膨脹與 rule replication 會是主要風險。DBTable 位於兩者之間：它使用 bit-based bucket 取得快速候選定位，同時保留精確比對避免分類錯誤。</w:t>
+        <w:t>從實測數字看，HybridTSS 的平均 lookup time 最低，只有 133.987 ns，但 memory 達 709.45 MiB，是三者中最高。這代表 HybridTSS 用大量記憶體換取非常快的查詢速度，適合記憶體資源充足且封包查詢量極大的系統。CutSplit 在本次數據中最均衡：build time 0.4625 s、average lookup time 300.719 ns、estimated memory 0.512 MiB，尤其記憶體使用量明顯最低。DBTable 在本專案的 Python 教學版中 build time 與 lookup time 都較高，因此若只看本次實測，CutSplit 是整體最好的選擇；但 DBTable 的論文價值在於 discriminative bitsets 的候選集合縮小策略，若使用完整 C++/SIMD/hash 最佳化實作，應再與 HybridTSS、CutSplit 做同環境比較。</w:t>
       </w:r>
     </w:p>
     <w:p>

</xml_diff>

<commit_message>
Run TA DBTable benchmark
</commit_message>
<xml_diff>
--- a/deliverables/DBTable_Final_Project_Report.docx
+++ b/deliverables/DBTable_Final_Project_Report.docx
@@ -1242,7 +1242,7 @@
         <w:spacing w:after="120"/>
       </w:pPr>
       <w:r>
-        <w:t>本專案實作位於 src/ 與 scripts/。為了讓實驗可重現，使用 Python 撰寫 DBTable-inspired classifier；外部 AMPS C++ 原始碼保留在 external/amps 作為參考。此實作保留 DBTable 用 discriminative bits 減少候選規則的核心概念，但不是 AMPS C++ DBTable 的逐行移植。</w:t>
+        <w:t>本專案原先使用 Python 教學版說明 DBTable 概念；本次依照助教提供的 DBTable.cpp / AMPS 官方 src/DBTable.cpp 改為 C++ 實測。benchmark harness 位於 cpp/benchmark_ta_dbtable.cpp，負責解析 ClassBench rules/trace、建立 DBT::DBTable、量測 build time、lookup time 與 memory estimate。可重現腳本為 scripts/run_ta_dbtable_experiment.py。</w:t>
       </w:r>
     </w:p>
     <w:tbl>
@@ -1309,7 +1309,7 @@
               <w:rPr>
                 <w:b w:val="0"/>
               </w:rPr>
-              <w:t>src/classbench.py</w:t>
+              <w:t>external/amps/src/DBTable.cpp</w:t>
             </w:r>
           </w:p>
         </w:tc>
@@ -1327,7 +1327,121 @@
               <w:rPr>
                 <w:b w:val="0"/>
               </w:rPr>
-              <w:t>ClassBench rule/trace parser 與精確五元組 match helper。</w:t>
+              <w:t>AMPS 官方 DBTable C++ 實作，與助教提供來源對應。</w:t>
+            </w:r>
+          </w:p>
+        </w:tc>
+      </w:tr>
+      <w:tr>
+        <w:tc>
+          <w:tcPr>
+            <w:tcW w:type="dxa" w:w="4896"/>
+            <w:vAlign w:val="center"/>
+          </w:tcPr>
+          <w:p>
+            <w:pPr>
+              <w:spacing w:after="40"/>
+            </w:pPr>
+            <w:r/>
+            <w:r>
+              <w:rPr>
+                <w:b w:val="0"/>
+              </w:rPr>
+              <w:t>cpp/benchmark_ta_dbtable.cpp</w:t>
+            </w:r>
+          </w:p>
+        </w:tc>
+        <w:tc>
+          <w:tcPr>
+            <w:tcW w:type="dxa" w:w="4896"/>
+            <w:vAlign w:val="center"/>
+          </w:tcPr>
+          <w:p>
+            <w:pPr>
+              <w:spacing w:after="40"/>
+            </w:pPr>
+            <w:r/>
+            <w:r>
+              <w:rPr>
+                <w:b w:val="0"/>
+              </w:rPr>
+              <w:t>C++ benchmark harness：讀取 ClassBench、建立 DBTable、量測效能。</w:t>
+            </w:r>
+          </w:p>
+        </w:tc>
+      </w:tr>
+      <w:tr>
+        <w:tc>
+          <w:tcPr>
+            <w:tcW w:type="dxa" w:w="4896"/>
+            <w:vAlign w:val="center"/>
+          </w:tcPr>
+          <w:p>
+            <w:pPr>
+              <w:spacing w:after="40"/>
+            </w:pPr>
+            <w:r/>
+            <w:r>
+              <w:rPr>
+                <w:b w:val="0"/>
+              </w:rPr>
+              <w:t>scripts/run_ta_dbtable_experiment.py</w:t>
+            </w:r>
+          </w:p>
+        </w:tc>
+        <w:tc>
+          <w:tcPr>
+            <w:tcW w:type="dxa" w:w="4896"/>
+            <w:vAlign w:val="center"/>
+          </w:tcPr>
+          <w:p>
+            <w:pPr>
+              <w:spacing w:after="40"/>
+            </w:pPr>
+            <w:r/>
+            <w:r>
+              <w:rPr>
+                <w:b w:val="0"/>
+              </w:rPr>
+              <w:t>自動編譯並重複執行 5 次，輸出 ta_dbtable_results.json/csv。</w:t>
+            </w:r>
+          </w:p>
+        </w:tc>
+      </w:tr>
+      <w:tr>
+        <w:tc>
+          <w:tcPr>
+            <w:tcW w:type="dxa" w:w="4896"/>
+            <w:vAlign w:val="center"/>
+          </w:tcPr>
+          <w:p>
+            <w:pPr>
+              <w:spacing w:after="40"/>
+            </w:pPr>
+            <w:r/>
+            <w:r>
+              <w:rPr>
+                <w:b w:val="0"/>
+              </w:rPr>
+              <w:t>ta_reference/DBTable.cpp</w:t>
+            </w:r>
+          </w:p>
+        </w:tc>
+        <w:tc>
+          <w:tcPr>
+            <w:tcW w:type="dxa" w:w="4896"/>
+            <w:vAlign w:val="center"/>
+          </w:tcPr>
+          <w:p>
+            <w:pPr>
+              <w:spacing w:after="40"/>
+            </w:pPr>
+            <w:r/>
+            <w:r>
+              <w:rPr>
+                <w:b w:val="0"/>
+              </w:rPr>
+              <w:t>保留助教給的原始檔作對照；本地複製檔有一行 Init 被註解吃掉，因此實測使用 AMPS 官方檔。</w:t>
             </w:r>
           </w:p>
         </w:tc>
@@ -1365,121 +1479,7 @@
               <w:rPr>
                 <w:b w:val="0"/>
               </w:rPr>
-              <w:t>DBTable-inspired discriminative-bit bucket classifier。</w:t>
-            </w:r>
-          </w:p>
-        </w:tc>
-      </w:tr>
-      <w:tr>
-        <w:tc>
-          <w:tcPr>
-            <w:tcW w:type="dxa" w:w="4896"/>
-            <w:vAlign w:val="center"/>
-          </w:tcPr>
-          <w:p>
-            <w:pPr>
-              <w:spacing w:after="40"/>
-            </w:pPr>
-            <w:r/>
-            <w:r>
-              <w:rPr>
-                <w:b w:val="0"/>
-              </w:rPr>
-              <w:t>scripts/run_experiment.py</w:t>
-            </w:r>
-          </w:p>
-        </w:tc>
-        <w:tc>
-          <w:tcPr>
-            <w:tcW w:type="dxa" w:w="4896"/>
-            <w:vAlign w:val="center"/>
-          </w:tcPr>
-          <w:p>
-            <w:pPr>
-              <w:spacing w:after="40"/>
-            </w:pPr>
-            <w:r/>
-            <w:r>
-              <w:rPr>
-                <w:b w:val="0"/>
-              </w:rPr>
-              <w:t>產生 build time、lookup time、memory consumption 結果。</w:t>
-            </w:r>
-          </w:p>
-        </w:tc>
-      </w:tr>
-      <w:tr>
-        <w:tc>
-          <w:tcPr>
-            <w:tcW w:type="dxa" w:w="4896"/>
-            <w:vAlign w:val="center"/>
-          </w:tcPr>
-          <w:p>
-            <w:pPr>
-              <w:spacing w:after="40"/>
-            </w:pPr>
-            <w:r/>
-            <w:r>
-              <w:rPr>
-                <w:b w:val="0"/>
-              </w:rPr>
-              <w:t>scripts/validate_correctness.py</w:t>
-            </w:r>
-          </w:p>
-        </w:tc>
-        <w:tc>
-          <w:tcPr>
-            <w:tcW w:type="dxa" w:w="4896"/>
-            <w:vAlign w:val="center"/>
-          </w:tcPr>
-          <w:p>
-            <w:pPr>
-              <w:spacing w:after="40"/>
-            </w:pPr>
-            <w:r/>
-            <w:r>
-              <w:rPr>
-                <w:b w:val="0"/>
-              </w:rPr>
-              <w:t>以線性掃描抽樣驗證查詢正確性。</w:t>
-            </w:r>
-          </w:p>
-        </w:tc>
-      </w:tr>
-      <w:tr>
-        <w:tc>
-          <w:tcPr>
-            <w:tcW w:type="dxa" w:w="4896"/>
-            <w:vAlign w:val="center"/>
-          </w:tcPr>
-          <w:p>
-            <w:pPr>
-              <w:spacing w:after="40"/>
-            </w:pPr>
-            <w:r/>
-            <w:r>
-              <w:rPr>
-                <w:b w:val="0"/>
-              </w:rPr>
-              <w:t>scripts/generate_classbench_dataset.ps1</w:t>
-            </w:r>
-          </w:p>
-        </w:tc>
-        <w:tc>
-          <w:tcPr>
-            <w:tcW w:type="dxa" w:w="4896"/>
-            <w:vAlign w:val="center"/>
-          </w:tcPr>
-          <w:p>
-            <w:pPr>
-              <w:spacing w:after="40"/>
-            </w:pPr>
-            <w:r/>
-            <w:r>
-              <w:rPr>
-                <w:b w:val="0"/>
-              </w:rPr>
-              <w:t>從 ClassBench seed 重新產生資料集的輔助腳本。</w:t>
+              <w:t>早期 Python 教學版，保留作概念對照，不作正式數據來源。</w:t>
             </w:r>
           </w:p>
         </w:tc>
@@ -1602,7 +1602,7 @@
               <w:rPr>
                 <w:b w:val="0"/>
               </w:rPr>
-              <w:t>Build time</w:t>
+              <w:t>Implementation</w:t>
             </w:r>
           </w:p>
         </w:tc>
@@ -1620,7 +1620,7 @@
               <w:rPr>
                 <w:b w:val="0"/>
               </w:rPr>
-              <w:t>1.5531 s</w:t>
+              <w:t>AMPS/TA DBTable.cpp</w:t>
             </w:r>
           </w:p>
         </w:tc>
@@ -1640,7 +1640,7 @@
               <w:rPr>
                 <w:b w:val="0"/>
               </w:rPr>
-              <w:t>Lookup total time</w:t>
+              <w:t>Repeat count</w:t>
             </w:r>
           </w:p>
         </w:tc>
@@ -1658,7 +1658,7 @@
               <w:rPr>
                 <w:b w:val="0"/>
               </w:rPr>
-              <w:t>1.2941 s</w:t>
+              <w:t>5</w:t>
             </w:r>
           </w:p>
         </w:tc>
@@ -1678,7 +1678,7 @@
               <w:rPr>
                 <w:b w:val="0"/>
               </w:rPr>
-              <w:t>Average lookup time</w:t>
+              <w:t>DBTable threshold (BINTH)</w:t>
             </w:r>
           </w:p>
         </w:tc>
@@ -1696,7 +1696,7 @@
               <w:rPr>
                 <w:b w:val="0"/>
               </w:rPr>
-              <w:t>9780.5 ns</w:t>
+              <w:t>4</w:t>
             </w:r>
           </w:p>
         </w:tc>
@@ -1716,7 +1716,7 @@
               <w:rPr>
                 <w:b w:val="0"/>
               </w:rPr>
-              <w:t>Median lookup time</w:t>
+              <w:t>Build time avg</w:t>
             </w:r>
           </w:p>
         </w:tc>
@@ -1734,7 +1734,7 @@
               <w:rPr>
                 <w:b w:val="0"/>
               </w:rPr>
-              <w:t>7500.0 ns</w:t>
+              <w:t>0.3777 s</w:t>
             </w:r>
           </w:p>
         </w:tc>
@@ -1754,7 +1754,7 @@
               <w:rPr>
                 <w:b w:val="0"/>
               </w:rPr>
-              <w:t>P95 lookup time</w:t>
+              <w:t>Build time min</w:t>
             </w:r>
           </w:p>
         </w:tc>
@@ -1772,7 +1772,7 @@
               <w:rPr>
                 <w:b w:val="0"/>
               </w:rPr>
-              <w:t>22700.0 ns</w:t>
+              <w:t>0.3382 s</w:t>
             </w:r>
           </w:p>
         </w:tc>
@@ -1792,7 +1792,7 @@
               <w:rPr>
                 <w:b w:val="0"/>
               </w:rPr>
-              <w:t>P99 lookup time</w:t>
+              <w:t>Lookup total time avg</w:t>
             </w:r>
           </w:p>
         </w:tc>
@@ -1810,7 +1810,7 @@
               <w:rPr>
                 <w:b w:val="0"/>
               </w:rPr>
-              <w:t>35100.0 ns</w:t>
+              <w:t>0.005990 s</w:t>
             </w:r>
           </w:p>
         </w:tc>
@@ -1830,7 +1830,7 @@
               <w:rPr>
                 <w:b w:val="0"/>
               </w:rPr>
-              <w:t>Throughput</w:t>
+              <w:t>Average lookup time avg</w:t>
             </w:r>
           </w:p>
         </w:tc>
@@ -1848,7 +1848,45 @@
               <w:rPr>
                 <w:b w:val="0"/>
               </w:rPr>
-              <w:t>0.0773 Mpps</w:t>
+              <w:t>59.902 ns</w:t>
+            </w:r>
+          </w:p>
+        </w:tc>
+      </w:tr>
+      <w:tr>
+        <w:tc>
+          <w:tcPr>
+            <w:tcW w:type="dxa" w:w="4896"/>
+            <w:vAlign w:val="center"/>
+          </w:tcPr>
+          <w:p>
+            <w:pPr>
+              <w:spacing w:after="40"/>
+            </w:pPr>
+            <w:r/>
+            <w:r>
+              <w:rPr>
+                <w:b w:val="0"/>
+              </w:rPr>
+              <w:t>Average lookup time min</w:t>
+            </w:r>
+          </w:p>
+        </w:tc>
+        <w:tc>
+          <w:tcPr>
+            <w:tcW w:type="dxa" w:w="4896"/>
+            <w:vAlign w:val="center"/>
+          </w:tcPr>
+          <w:p>
+            <w:pPr>
+              <w:spacing w:after="40"/>
+            </w:pPr>
+            <w:r/>
+            <w:r>
+              <w:rPr>
+                <w:b w:val="0"/>
+              </w:rPr>
+              <w:t>52.750 ns</w:t>
             </w:r>
           </w:p>
         </w:tc>
@@ -1886,121 +1924,7 @@
               <w:rPr>
                 <w:b w:val="0"/>
               </w:rPr>
-              <w:t>20.55 MiB</w:t>
-            </w:r>
-          </w:p>
-        </w:tc>
-      </w:tr>
-      <w:tr>
-        <w:tc>
-          <w:tcPr>
-            <w:tcW w:type="dxa" w:w="4896"/>
-            <w:vAlign w:val="center"/>
-          </w:tcPr>
-          <w:p>
-            <w:pPr>
-              <w:spacing w:after="40"/>
-            </w:pPr>
-            <w:r/>
-            <w:r>
-              <w:rPr>
-                <w:b w:val="0"/>
-              </w:rPr>
-              <w:t>Bucket count</w:t>
-            </w:r>
-          </w:p>
-        </w:tc>
-        <w:tc>
-          <w:tcPr>
-            <w:tcW w:type="dxa" w:w="4896"/>
-            <w:vAlign w:val="center"/>
-          </w:tcPr>
-          <w:p>
-            <w:pPr>
-              <w:spacing w:after="40"/>
-            </w:pPr>
-            <w:r/>
-            <w:r>
-              <w:rPr>
-                <w:b w:val="0"/>
-              </w:rPr>
-              <w:t>4,096</w:t>
-            </w:r>
-          </w:p>
-        </w:tc>
-      </w:tr>
-      <w:tr>
-        <w:tc>
-          <w:tcPr>
-            <w:tcW w:type="dxa" w:w="4896"/>
-            <w:vAlign w:val="center"/>
-          </w:tcPr>
-          <w:p>
-            <w:pPr>
-              <w:spacing w:after="40"/>
-            </w:pPr>
-            <w:r/>
-            <w:r>
-              <w:rPr>
-                <w:b w:val="0"/>
-              </w:rPr>
-              <w:t>Average bucket size</w:t>
-            </w:r>
-          </w:p>
-        </w:tc>
-        <w:tc>
-          <w:tcPr>
-            <w:tcW w:type="dxa" w:w="4896"/>
-            <w:vAlign w:val="center"/>
-          </w:tcPr>
-          <w:p>
-            <w:pPr>
-              <w:spacing w:after="40"/>
-            </w:pPr>
-            <w:r/>
-            <w:r>
-              <w:rPr>
-                <w:b w:val="0"/>
-              </w:rPr>
-              <w:t>169.30 rules</w:t>
-            </w:r>
-          </w:p>
-        </w:tc>
-      </w:tr>
-      <w:tr>
-        <w:tc>
-          <w:tcPr>
-            <w:tcW w:type="dxa" w:w="4896"/>
-            <w:vAlign w:val="center"/>
-          </w:tcPr>
-          <w:p>
-            <w:pPr>
-              <w:spacing w:after="40"/>
-            </w:pPr>
-            <w:r/>
-            <w:r>
-              <w:rPr>
-                <w:b w:val="0"/>
-              </w:rPr>
-              <w:t>Max bucket size</w:t>
-            </w:r>
-          </w:p>
-        </w:tc>
-        <w:tc>
-          <w:tcPr>
-            <w:tcW w:type="dxa" w:w="4896"/>
-            <w:vAlign w:val="center"/>
-          </w:tcPr>
-          <w:p>
-            <w:pPr>
-              <w:spacing w:after="40"/>
-            </w:pPr>
-            <w:r/>
-            <w:r>
-              <w:rPr>
-                <w:b w:val="0"/>
-              </w:rPr>
-              <w:t>189 rules</w:t>
+              <w:t>4.017 MiB</w:t>
             </w:r>
           </w:p>
         </w:tc>
@@ -2012,7 +1936,7 @@
         <w:spacing w:after="120"/>
       </w:pPr>
       <w:r>
-        <w:t>結果顯示，selected bits 將近十萬筆規則分散到 4096 個 bucket，平均每個 bucket 約 169 筆規則。這代表查詢階段大多只需要檢查候選 bucket，而不是掃描完整 ruleset。</w:t>
+        <w:t>結果顯示，改用 AMPS/助教 C++ DBTable.cpp 後，lookup time 大幅下降到數十 ns 等級。這代表先前 Python 版本主要適合說明概念，不適合作為正式效能比較。正式比較應以本節 C++ 實測數字為準。</w:t>
       </w:r>
     </w:p>
     <w:p>
@@ -2032,7 +1956,7 @@
         <w:spacing w:after="120"/>
       </w:pPr>
       <w:r>
-        <w:t>本節比較 DBTable、HybridTSS 與 CutSplit 三種方法。需要注意的是，本專案的 DBTable 是 Python 教學版 DBTable-inspired implementation；組員的 HybridTSS 與 CutSplit 數據可能來自不同語言或最佳化程度，因此絕對數字同時反映演算法與實作差異。不過，這些數據仍可用來分析不同方法在 build time、lookup time 與 memory 的取捨。</w:t>
+        <w:t>本節比較 DBTable、HybridTSS 與 CutSplit 三種方法。DBTable 數據已改用 AMPS/助教 C++ DBTable.cpp 重新量測，與先前 Python 教學版不同。三者都使用 ClassBench acl1_100k 類資料，但 CutSplit 回報實際載入 99,833 筆規則，DBTable 本次載入 99,330 筆規則，因此仍需注意資料與實作細節差異。</w:t>
       </w:r>
     </w:p>
     <w:tbl>
@@ -2303,7 +2227,7 @@
               <w:rPr>
                 <w:b w:val="0"/>
               </w:rPr>
-              <w:t>1.5531 s</w:t>
+              <w:t>0.3777 s</w:t>
             </w:r>
           </w:p>
         </w:tc>
@@ -2377,7 +2301,7 @@
               <w:rPr>
                 <w:b w:val="0"/>
               </w:rPr>
-              <w:t>9780.5 ns</w:t>
+              <w:t>59.902 ns</w:t>
             </w:r>
           </w:p>
         </w:tc>
@@ -2451,7 +2375,7 @@
               <w:rPr>
                 <w:b w:val="0"/>
               </w:rPr>
-              <w:t>20.55 MiB</w:t>
+              <w:t>4.017 MiB</w:t>
             </w:r>
           </w:p>
         </w:tc>
@@ -2525,7 +2449,7 @@
               <w:rPr>
                 <w:b w:val="0"/>
               </w:rPr>
-              <w:t>概念上能把查詢縮到小 bucket，且最後仍做 exact match。</w:t>
+              <w:t>lookup time 最低，memory 也遠低於 HybridTSS。</w:t>
             </w:r>
           </w:p>
         </w:tc>
@@ -2543,7 +2467,7 @@
               <w:rPr>
                 <w:b w:val="0"/>
               </w:rPr>
-              <w:t>lookup time 最低，適合極度重視查詢延遲且記憶體充足的情境。</w:t>
+              <w:t>build time 最短。</w:t>
             </w:r>
           </w:p>
         </w:tc>
@@ -2561,7 +2485,7 @@
               <w:rPr>
                 <w:b w:val="0"/>
               </w:rPr>
-              <w:t>build/lookup/memory 三者都很均衡，本次數據中 memory 最低。</w:t>
+              <w:t>memory 最低，build/lookup/memory 整體均衡。</w:t>
             </w:r>
           </w:p>
         </w:tc>
@@ -2599,7 +2523,7 @@
               <w:rPr>
                 <w:b w:val="0"/>
               </w:rPr>
-              <w:t>目前 Python 教學版 lookup 較慢；wildcard prefix 可能造成 bucket replication。</w:t>
+              <w:t>build time 不是最低，memory 高於 CutSplit。</w:t>
             </w:r>
           </w:p>
         </w:tc>
@@ -2617,7 +2541,7 @@
               <w:rPr>
                 <w:b w:val="0"/>
               </w:rPr>
-              <w:t>memory consumption 很高，約為 DBTable 實測的 34.5 倍。</w:t>
+              <w:t>memory consumption 很高，約為 DBTable 的 176.6 倍。</w:t>
             </w:r>
           </w:p>
         </w:tc>
@@ -2635,7 +2559,7 @@
               <w:rPr>
                 <w:b w:val="0"/>
               </w:rPr>
-              <w:t>lookup 比 HybridTSS 慢，但仍遠快於本專案 Python DBTable；決策切分品質依 ruleset 分布而定。</w:t>
+              <w:t>lookup 比 DBTable 與 HybridTSS 慢。</w:t>
             </w:r>
           </w:p>
         </w:tc>
@@ -2673,7 +2597,7 @@
               <w:rPr>
                 <w:b w:val="0"/>
               </w:rPr>
-              <w:t>規則 IP prefix 具明顯分布差異，且可接受建表與記憶體換 lookup。</w:t>
+              <w:t>需要極低 lookup latency，同時希望 memory 不像 HybridTSS 那麼高。</w:t>
             </w:r>
           </w:p>
         </w:tc>
@@ -2691,7 +2615,7 @@
               <w:rPr>
                 <w:b w:val="0"/>
               </w:rPr>
-              <w:t>記憶體不是瓶頸、需要最低平均 lookup latency。</w:t>
+              <w:t>需要極快建表且記憶體充足。</w:t>
             </w:r>
           </w:p>
         </w:tc>
@@ -2709,7 +2633,7 @@
               <w:rPr>
                 <w:b w:val="0"/>
               </w:rPr>
-              <w:t>需要低記憶體且仍保有快速查詢的整體平衡情境。</w:t>
+              <w:t>低記憶體設備或整體平衡需求。</w:t>
             </w:r>
           </w:p>
         </w:tc>
@@ -2721,7 +2645,7 @@
         <w:spacing w:after="120"/>
       </w:pPr>
       <w:r>
-        <w:t>從實測數字看，HybridTSS 的平均 lookup time 最低，只有 133.987 ns，但 memory 達 709.45 MiB，是三者中最高。這代表 HybridTSS 用大量記憶體換取非常快的查詢速度，適合記憶體資源充足且封包查詢量極大的系統。CutSplit 在本次數據中最均衡：build time 0.4625 s、average lookup time 300.719 ns、estimated memory 0.512 MiB，尤其記憶體使用量明顯最低。DBTable 在本專案的 Python 教學版中 build time 與 lookup time 都較高，因此若只看本次實測，CutSplit 是整體最好的選擇；但 DBTable 的論文價值在於 discriminative bitsets 的候選集合縮小策略，若使用完整 C++/SIMD/hash 最佳化實作，應再與 HybridTSS、CutSplit 做同環境比較。</w:t>
+        <w:t>從更新後的 C++ 實測數字看，DBTable 平均 lookup time 為 59.902 ns，是三者中最低；HybridTSS 為 133.987 ns，CutSplit 為 300.719 ns。HybridTSS 的 build time 只有 0.0249 s，是三者最快，但 memory 達 709.45 MiB，成本最高。CutSplit 的 memory 只有 0.512 MiB，是三者最低，適合記憶體受限情境。整體來看，DBTable 在本次比較中提供最佳查詢延遲與可接受的記憶體；CutSplit 則是最佳低記憶體選擇；HybridTSS 適合極快建表但記憶體充足的情境。</w:t>
       </w:r>
     </w:p>
     <w:p>

</xml_diff>